<commit_message>
adding the lebanon site under projects
</commit_message>
<xml_diff>
--- a/content/files/alamine_resume.docx
+++ b/content/files/alamine_resume.docx
@@ -5,29 +5,29 @@
     <w:tbl>
       <w:tblPr>
         <w:tblStyle w:val="TableGrid"/>
-        <w:tblW w:w="11257" w:type="dxa"/>
+        <w:tblW w:w="11297" w:type="dxa"/>
         <w:tblInd w:w="-270" w:type="dxa"/>
         <w:tblLayout w:type="fixed"/>
         <w:tblLook w:val="04A0" w:firstRow="1" w:lastRow="0" w:firstColumn="1" w:lastColumn="0" w:noHBand="0" w:noVBand="1"/>
       </w:tblPr>
       <w:tblGrid>
-        <w:gridCol w:w="1904"/>
-        <w:gridCol w:w="91"/>
-        <w:gridCol w:w="6493"/>
-        <w:gridCol w:w="1034"/>
-        <w:gridCol w:w="654"/>
-        <w:gridCol w:w="1051"/>
-        <w:gridCol w:w="30"/>
+        <w:gridCol w:w="1910"/>
+        <w:gridCol w:w="92"/>
+        <w:gridCol w:w="6515"/>
+        <w:gridCol w:w="1038"/>
+        <w:gridCol w:w="657"/>
+        <w:gridCol w:w="1053"/>
+        <w:gridCol w:w="32"/>
       </w:tblGrid>
       <w:tr>
         <w:trPr>
           <w:gridAfter w:val="1"/>
-          <w:wAfter w:w="30" w:type="dxa"/>
-          <w:trHeight w:val="1381"/>
+          <w:wAfter w:w="32" w:type="dxa"/>
+          <w:trHeight w:val="1150"/>
         </w:trPr>
         <w:tc>
           <w:tcPr>
-            <w:tcW w:w="1904" w:type="dxa"/>
+            <w:tcW w:w="1910" w:type="dxa"/>
             <w:tcBorders>
               <w:top w:val="nil"/>
               <w:left w:val="nil"/>
@@ -49,7 +49,7 @@
         </w:tc>
         <w:tc>
           <w:tcPr>
-            <w:tcW w:w="6584" w:type="dxa"/>
+            <w:tcW w:w="6607" w:type="dxa"/>
             <w:gridSpan w:val="2"/>
             <w:tcBorders>
               <w:top w:val="nil"/>
@@ -189,7 +189,7 @@
         </w:tc>
         <w:tc>
           <w:tcPr>
-            <w:tcW w:w="2739" w:type="dxa"/>
+            <w:tcW w:w="2748" w:type="dxa"/>
             <w:gridSpan w:val="3"/>
             <w:tcBorders>
               <w:top w:val="nil"/>
@@ -213,11 +213,11 @@
       </w:tr>
       <w:tr>
         <w:trPr>
-          <w:trHeight w:val="301"/>
+          <w:trHeight w:val="276"/>
         </w:trPr>
         <w:tc>
           <w:tcPr>
-            <w:tcW w:w="11257" w:type="dxa"/>
+            <w:tcW w:w="11297" w:type="dxa"/>
             <w:gridSpan w:val="7"/>
             <w:tcBorders>
               <w:top w:val="nil"/>
@@ -259,11 +259,11 @@
       </w:tr>
       <w:tr>
         <w:trPr>
-          <w:trHeight w:val="4641"/>
+          <w:trHeight w:val="4262"/>
         </w:trPr>
         <w:tc>
           <w:tcPr>
-            <w:tcW w:w="1904" w:type="dxa"/>
+            <w:tcW w:w="1910" w:type="dxa"/>
             <w:tcBorders>
               <w:top w:val="single" w:sz="4" w:space="0" w:color="7F7F7F" w:themeColor="text1" w:themeTint="80"/>
               <w:left w:val="nil"/>
@@ -298,7 +298,7 @@
         </w:tc>
         <w:tc>
           <w:tcPr>
-            <w:tcW w:w="7618" w:type="dxa"/>
+            <w:tcW w:w="7645" w:type="dxa"/>
             <w:gridSpan w:val="3"/>
             <w:tcBorders>
               <w:top w:val="single" w:sz="4" w:space="0" w:color="7F7F7F" w:themeColor="text1" w:themeTint="80"/>
@@ -820,7 +820,7 @@
         </w:tc>
         <w:tc>
           <w:tcPr>
-            <w:tcW w:w="1733" w:type="dxa"/>
+            <w:tcW w:w="1741" w:type="dxa"/>
             <w:gridSpan w:val="3"/>
             <w:tcBorders>
               <w:top w:val="single" w:sz="4" w:space="0" w:color="7F7F7F" w:themeColor="text1" w:themeTint="80"/>
@@ -882,11 +882,11 @@
       </w:tr>
       <w:tr>
         <w:trPr>
-          <w:trHeight w:val="2979"/>
+          <w:trHeight w:val="2736"/>
         </w:trPr>
         <w:tc>
           <w:tcPr>
-            <w:tcW w:w="1904" w:type="dxa"/>
+            <w:tcW w:w="1910" w:type="dxa"/>
             <w:tcBorders>
               <w:top w:val="nil"/>
               <w:left w:val="nil"/>
@@ -920,7 +920,7 @@
         </w:tc>
         <w:tc>
           <w:tcPr>
-            <w:tcW w:w="7618" w:type="dxa"/>
+            <w:tcW w:w="7645" w:type="dxa"/>
             <w:gridSpan w:val="3"/>
             <w:tcBorders>
               <w:top w:val="nil"/>
@@ -1061,7 +1061,7 @@
         </w:tc>
         <w:tc>
           <w:tcPr>
-            <w:tcW w:w="1733" w:type="dxa"/>
+            <w:tcW w:w="1741" w:type="dxa"/>
             <w:gridSpan w:val="3"/>
             <w:tcBorders>
               <w:top w:val="nil"/>
@@ -1126,11 +1126,11 @@
       </w:tr>
       <w:tr>
         <w:trPr>
-          <w:trHeight w:val="1259"/>
+          <w:trHeight w:val="977"/>
         </w:trPr>
         <w:tc>
           <w:tcPr>
-            <w:tcW w:w="1904" w:type="dxa"/>
+            <w:tcW w:w="1910" w:type="dxa"/>
             <w:tcBorders>
               <w:top w:val="nil"/>
               <w:left w:val="nil"/>
@@ -1174,7 +1174,7 @@
         </w:tc>
         <w:tc>
           <w:tcPr>
-            <w:tcW w:w="7618" w:type="dxa"/>
+            <w:tcW w:w="7645" w:type="dxa"/>
             <w:gridSpan w:val="3"/>
             <w:tcBorders>
               <w:top w:val="nil"/>
@@ -1289,7 +1289,7 @@
         </w:tc>
         <w:tc>
           <w:tcPr>
-            <w:tcW w:w="1733" w:type="dxa"/>
+            <w:tcW w:w="1741" w:type="dxa"/>
             <w:gridSpan w:val="3"/>
             <w:tcBorders>
               <w:top w:val="nil"/>
@@ -1353,11 +1353,11 @@
       </w:tr>
       <w:tr>
         <w:trPr>
-          <w:trHeight w:val="238"/>
+          <w:trHeight w:val="91"/>
         </w:trPr>
         <w:tc>
           <w:tcPr>
-            <w:tcW w:w="11257" w:type="dxa"/>
+            <w:tcW w:w="11297" w:type="dxa"/>
             <w:gridSpan w:val="7"/>
             <w:tcBorders>
               <w:top w:val="nil"/>
@@ -1390,12 +1390,12 @@
       <w:tr>
         <w:trPr>
           <w:gridAfter w:val="2"/>
-          <w:wAfter w:w="1081" w:type="dxa"/>
-          <w:trHeight w:val="785"/>
+          <w:wAfter w:w="1085" w:type="dxa"/>
+          <w:trHeight w:val="721"/>
         </w:trPr>
         <w:tc>
           <w:tcPr>
-            <w:tcW w:w="1995" w:type="dxa"/>
+            <w:tcW w:w="2002" w:type="dxa"/>
             <w:gridSpan w:val="2"/>
             <w:tcBorders>
               <w:top w:val="single" w:sz="4" w:space="0" w:color="7F7F7F" w:themeColor="text1" w:themeTint="80"/>
@@ -1430,7 +1430,7 @@
         </w:tc>
         <w:tc>
           <w:tcPr>
-            <w:tcW w:w="8181" w:type="dxa"/>
+            <w:tcW w:w="8210" w:type="dxa"/>
             <w:gridSpan w:val="3"/>
             <w:tcBorders>
               <w:top w:val="single" w:sz="4" w:space="0" w:color="7F7F7F" w:themeColor="text1" w:themeTint="80"/>
@@ -1492,12 +1492,12 @@
       <w:tr>
         <w:trPr>
           <w:gridAfter w:val="2"/>
-          <w:wAfter w:w="1081" w:type="dxa"/>
-          <w:trHeight w:val="1008"/>
+          <w:wAfter w:w="1085" w:type="dxa"/>
+          <w:trHeight w:val="795"/>
         </w:trPr>
         <w:tc>
           <w:tcPr>
-            <w:tcW w:w="1995" w:type="dxa"/>
+            <w:tcW w:w="2002" w:type="dxa"/>
             <w:gridSpan w:val="2"/>
             <w:tcBorders>
               <w:top w:val="nil"/>
@@ -1532,7 +1532,7 @@
         </w:tc>
         <w:tc>
           <w:tcPr>
-            <w:tcW w:w="8181" w:type="dxa"/>
+            <w:tcW w:w="8210" w:type="dxa"/>
             <w:gridSpan w:val="3"/>
             <w:tcBorders>
               <w:top w:val="nil"/>
@@ -1608,11 +1608,11 @@
       </w:tr>
       <w:tr>
         <w:trPr>
-          <w:trHeight w:val="114"/>
+          <w:trHeight w:val="104"/>
         </w:trPr>
         <w:tc>
           <w:tcPr>
-            <w:tcW w:w="11257" w:type="dxa"/>
+            <w:tcW w:w="11297" w:type="dxa"/>
             <w:gridSpan w:val="7"/>
             <w:tcBorders>
               <w:top w:val="nil"/>
@@ -1645,11 +1645,11 @@
       </w:tr>
       <w:tr>
         <w:trPr>
-          <w:trHeight w:val="787"/>
+          <w:trHeight w:val="722"/>
         </w:trPr>
         <w:tc>
           <w:tcPr>
-            <w:tcW w:w="11257" w:type="dxa"/>
+            <w:tcW w:w="11297" w:type="dxa"/>
             <w:gridSpan w:val="7"/>
             <w:tcBorders>
               <w:top w:val="single" w:sz="4" w:space="0" w:color="7F7F7F" w:themeColor="text1" w:themeTint="80"/>
@@ -1708,10 +1708,11 @@
                 <w:tab w:val="clear" w:pos="360"/>
               </w:tabs>
               <w:spacing w:after="0" w:line="276" w:lineRule="auto"/>
-              <w:ind w:left="700" w:right="-180" w:hanging="345"/>
-              <w:rPr>
-                <w:sz w:val="24"/>
-                <w:szCs w:val="28"/>
+              <w:ind w:left="700" w:hanging="345"/>
+              <w:rPr>
+                <w:sz w:val="24"/>
+                <w:szCs w:val="28"/>
+                <w:lang w:val="en-US"/>
               </w:rPr>
             </w:pPr>
             <w:r>
@@ -1722,15 +1723,31 @@
                 <w:szCs w:val="28"/>
                 <w:lang w:val="en-US"/>
               </w:rPr>
-              <w:t xml:space="preserve">Data: </w:t>
-            </w:r>
-            <w:r>
-              <w:rPr>
-                <w:sz w:val="24"/>
-                <w:szCs w:val="28"/>
-                <w:lang w:val="en-US"/>
-              </w:rPr>
-              <w:t>Exploration, analysis, cleaning, statistical analysis, modeling, web scraping, survey design, data visualization.</w:t>
+              <w:t xml:space="preserve">Econometrics: </w:t>
+            </w:r>
+            <w:r>
+              <w:rPr>
+                <w:sz w:val="24"/>
+                <w:szCs w:val="28"/>
+                <w:lang w:val="en-US"/>
+              </w:rPr>
+              <w:t>OLS, Fixed Effects, 2SLS, Causal Inference (Reg</w:t>
+            </w:r>
+            <w:r>
+              <w:rPr>
+                <w:sz w:val="24"/>
+                <w:szCs w:val="28"/>
+                <w:lang w:val="en-US"/>
+              </w:rPr>
+              <w:t>ression</w:t>
+            </w:r>
+            <w:r>
+              <w:rPr>
+                <w:sz w:val="24"/>
+                <w:szCs w:val="28"/>
+                <w:lang w:val="en-US"/>
+              </w:rPr>
+              <w:t xml:space="preserve"> Discontinuity, Matching Methods, IV)</w:t>
             </w:r>
           </w:p>
           <w:p>
@@ -1755,32 +1772,72 @@
                 <w:szCs w:val="28"/>
                 <w:lang w:val="en-US"/>
               </w:rPr>
-              <w:t xml:space="preserve">Econometrics: </w:t>
-            </w:r>
-            <w:r>
-              <w:rPr>
-                <w:sz w:val="24"/>
-                <w:szCs w:val="28"/>
-                <w:lang w:val="en-US"/>
-              </w:rPr>
-              <w:t>OLS, Fixed Effects, 2SLS, Causal Inference (Reg</w:t>
-            </w:r>
-            <w:r>
-              <w:rPr>
-                <w:sz w:val="24"/>
-                <w:szCs w:val="28"/>
-                <w:lang w:val="en-US"/>
-              </w:rPr>
-              <w:t>ression</w:t>
-            </w:r>
-            <w:r>
-              <w:rPr>
-                <w:sz w:val="24"/>
-                <w:szCs w:val="28"/>
-                <w:lang w:val="en-US"/>
-              </w:rPr>
-              <w:t xml:space="preserve"> Discontinuity, Matching Methods, IV)</w:t>
-            </w:r>
+              <w:t>Machine Learning</w:t>
+            </w:r>
+            <w:r>
+              <w:rPr>
+                <w:sz w:val="24"/>
+                <w:szCs w:val="28"/>
+                <w:lang w:val="en-US"/>
+              </w:rPr>
+              <w:t xml:space="preserve">: </w:t>
+            </w:r>
+            <w:r>
+              <w:rPr>
+                <w:sz w:val="24"/>
+                <w:szCs w:val="28"/>
+                <w:lang w:val="en-US"/>
+              </w:rPr>
+              <w:t>Classifications Models, Support Vector Machines, Tree Methods, Neural Network</w:t>
+            </w:r>
+          </w:p>
+          <w:p>
+            <w:pPr>
+              <w:pStyle w:val="Logro"/>
+              <w:tabs>
+                <w:tab w:val="clear" w:pos="360"/>
+              </w:tabs>
+              <w:spacing w:after="0" w:line="276" w:lineRule="auto"/>
+              <w:ind w:left="700" w:right="-180" w:hanging="345"/>
+              <w:rPr>
+                <w:sz w:val="24"/>
+                <w:szCs w:val="28"/>
+              </w:rPr>
+            </w:pPr>
+            <w:r>
+              <w:rPr>
+                <w:b/>
+                <w:bCs/>
+                <w:sz w:val="24"/>
+                <w:szCs w:val="28"/>
+                <w:lang w:val="en-US"/>
+              </w:rPr>
+              <w:t xml:space="preserve">Data: </w:t>
+            </w:r>
+            <w:r>
+              <w:rPr>
+                <w:sz w:val="24"/>
+                <w:szCs w:val="28"/>
+                <w:lang w:val="en-US"/>
+              </w:rPr>
+              <w:t>Exploration, analysis, cleaning, statistical analysis, modeling, web scraping, survey design, data visualization.</w:t>
+            </w:r>
+          </w:p>
+          <w:p>
+            <w:pPr>
+              <w:pStyle w:val="Logro"/>
+              <w:numPr>
+                <w:ilvl w:val="0"/>
+                <w:numId w:val="0"/>
+              </w:numPr>
+              <w:spacing w:after="0" w:line="276" w:lineRule="auto"/>
+              <w:ind w:left="355"/>
+              <w:rPr>
+                <w:sz w:val="24"/>
+                <w:szCs w:val="28"/>
+                <w:lang w:val="en-US"/>
+              </w:rPr>
+            </w:pPr>
           </w:p>
           <w:p>
             <w:pPr>

</xml_diff>